<commit_message>
Fix equation-editor rendering: handle \mathcal operators and space-separated accents so all fractions/derivatives typeset properly
</commit_message>
<xml_diff>
--- a/Equations_UnicodeMath.docx
+++ b/Equations_UnicodeMath.docx
@@ -655,7 +655,7 @@
           <w:sz w:val="20"/>
           <w:szCs w:val="20"/>
         </w:rPr>
-        <w:t xml:space="preserve">u=λ u_w, v=v_w, T=T^∗_0, C=C^∗_0 text(at )y=0</w:t>
+        <w:t xml:space="preserve">u=λ u_w, v=v_w, T=T^∗_0, C=C^∗_0 at y=0</w:t>
       </w:r>
     </w:p>
     <w:p>
@@ -681,7 +681,7 @@
           <w:sz w:val="20"/>
           <w:szCs w:val="20"/>
         </w:rPr>
-        <w:t xml:space="preserve">u=0, v=(dh)/(dt), T=T_2, C=C_2 text(at )y=h(t)</w:t>
+        <w:t xml:space="preserve">u=0, v=(dh)/(dt), T=T_2, C=C_2 at y=h(t)</w:t>
       </w:r>
     </w:p>
     <w:p>
@@ -1851,7 +1851,7 @@
           <w:sz w:val="20"/>
           <w:szCs w:val="20"/>
         </w:rPr>
-        <w:t xml:space="preserve">Be→1 (text(heat/mass dominated)), Be→0 (text(friction/Joule dominated)), Be=0.5 (text(crossover))</w:t>
+        <w:t xml:space="preserve">Be→1 (heat/mass dominated), Be→0 (friction/Joule dominated), Be=0.5 (crossover)</w:t>
       </w:r>
     </w:p>
     <w:p>
@@ -1955,7 +1955,7 @@
           <w:sz w:val="20"/>
           <w:szCs w:val="20"/>
         </w:rPr>
-        <w:t xml:space="preserve">mathcal(L)_f=(d^4)/(dη^4)</w:t>
+        <w:t xml:space="preserve">L_f=(d^4)/(dη^4)</w:t>
       </w:r>
     </w:p>
     <w:p>
@@ -1981,7 +1981,7 @@
           <w:sz w:val="20"/>
           <w:szCs w:val="20"/>
         </w:rPr>
-        <w:t xml:space="preserve">mathcal(L)_θ=(d^2)/(dη^2), mathcal(L)_φ=(d^2)/(dη^2)</w:t>
+        <w:t xml:space="preserve">L_θ=(d^2)/(dη^2), L_φ=(d^2)/(dη^2)</w:t>
       </w:r>
     </w:p>
     <w:p>
@@ -2007,7 +2007,7 @@
           <w:sz w:val="20"/>
           <w:szCs w:val="20"/>
         </w:rPr>
-        <w:t xml:space="preserve">mathcal(L)_f(c_1+c_2η+c_3η^2+c_4η^3)=0, mathcal(L)_θ(c_5+c_6η)=0, mathcal(L)_φ(c_7+c_8η)=0</w:t>
+        <w:t xml:space="preserve">L_f(c_1+c_2η+c_3η^2+c_4η^3)=0, L_θ(c_5+c_6η)=0, L_φ(c_7+c_8η)=0</w:t>
       </w:r>
     </w:p>
     <w:p>
@@ -2033,7 +2033,7 @@
           <w:sz w:val="20"/>
           <w:szCs w:val="20"/>
         </w:rPr>
-        <w:t xml:space="preserve">mathcal(N)_f=(A_1)/(A_2)(1+(1)/(β^∗))(∂^4̂ f)/(∂η^4)+̂ f(∂^3̂ f)/(∂η^3)-(∂̂ f)/(∂η)(∂^2̂ f)/(∂η^2)-(Sq)/(2)(3(∂^2̂ f)/(∂η^2)+η(∂^3̂ f)/(∂η^3))-(A_3)/(A_2)M(∂^2̂ f)/(∂η^2)-(A_1)/(A_2)(1+(1)/(β^∗))K_P(∂^2̂ f)/(∂η^2)</w:t>
+        <w:t xml:space="preserve">N_f=(A_1)/(A_2)(1+(1)/(β^∗))(∂^4̂ f)/(∂η^4)+̂ f(∂^3̂ f)/(∂η^3)-(∂̂ f)/(∂η)(∂^2̂ f)/(∂η^2)-(Sq)/(2)(3(∂^2̂ f)/(∂η^2)+η(∂^3̂ f)/(∂η^3))-(A_3)/(A_2)M(∂^2̂ f)/(∂η^2)-(A_1)/(A_2)(1+(1)/(β^∗))K_P(∂^2̂ f)/(∂η^2)</w:t>
       </w:r>
     </w:p>
     <w:p>
@@ -2059,7 +2059,7 @@
           <w:sz w:val="20"/>
           <w:szCs w:val="20"/>
         </w:rPr>
-        <w:t xml:space="preserve">mathcal(N)_θ=(A_4+(4)/(3)Rd)(∂^2̂θ)/(∂η^2)-Pr Hs ̂θ-A_5Pr((Sq)/(2)η-̂ f)(∂̂θ)/(∂η)+A_1(1+(1)/(β^∗))Ec Pr[4γ((∂̂ f)/(∂η))^2+((∂^2̂ f)/(∂η^2))^2]+A_3Ec Pr M((∂̂ f)/(∂η))^2+Pr Df(∂^2̂φ)/(∂η^2)</w:t>
+        <w:t xml:space="preserve">N_θ=(A_4+(4)/(3)Rd)(∂^2̂θ)/(∂η^2)-Pr Hs ̂θ-A_5Pr((Sq)/(2)η-̂ f)(∂̂θ)/(∂η)+A_1(1+(1)/(β^∗))Ec Pr[4γ((∂̂ f)/(∂η))^2+((∂^2̂ f)/(∂η^2))^2]+A_3Ec Pr M((∂̂ f)/(∂η))^2+Pr Df(∂^2̂φ)/(∂η^2)</w:t>
       </w:r>
     </w:p>
     <w:p>
@@ -2085,7 +2085,7 @@
           <w:sz w:val="20"/>
           <w:szCs w:val="20"/>
         </w:rPr>
-        <w:t xml:space="preserve">mathcal(N)_φ=(∂^2̂φ)/(∂η^2)+Sc(̂ f(∂̂φ)/(∂η)-(∂̂ f)/(∂η)̂φ)-Sc(Sq)/(2)η(∂̂φ)/(∂η)-Sc K (1+δ_T̂θ)^(n)e^(-E/(1+δ_T̂θ))̂φ+Sc Sr(∂^2̂θ)/(∂η^2)</w:t>
+        <w:t xml:space="preserve">N_φ=(∂^2̂φ)/(∂η^2)+Sc(̂ f(∂̂φ)/(∂η)-(∂̂ f)/(∂η)̂φ)-Sc(Sq)/(2)η(∂̂φ)/(∂η)-Sc K (1+δ_T̂θ)^(n)e^(-E/(1+δ_T̂θ))̂φ+Sc Sr(∂^2̂θ)/(∂η^2)</w:t>
       </w:r>
     </w:p>
     <w:p>
@@ -2111,7 +2111,7 @@
           <w:sz w:val="20"/>
           <w:szCs w:val="20"/>
         </w:rPr>
-        <w:t xml:space="preserve">(1-p)mathcal(L)_f[̂ f-f_0]=pℏ_fH_fmathcal(N)_f</w:t>
+        <w:t xml:space="preserve">(1-p)L_f[̂ f-f_0]=pℏ_fH_fN_f</w:t>
       </w:r>
     </w:p>
     <w:p>
@@ -2137,7 +2137,7 @@
           <w:sz w:val="20"/>
           <w:szCs w:val="20"/>
         </w:rPr>
-        <w:t xml:space="preserve">(1-p)mathcal(L)_θ[̂θ-θ_0]=pℏ_θ H_θmathcal(N)_θ</w:t>
+        <w:t xml:space="preserve">(1-p)L_θ[̂θ-θ_0]=pℏ_θ H_θN_θ</w:t>
       </w:r>
     </w:p>
     <w:p>
@@ -2163,7 +2163,7 @@
           <w:sz w:val="20"/>
           <w:szCs w:val="20"/>
         </w:rPr>
-        <w:t xml:space="preserve">(1-p)mathcal(L)_φ[̂φ-φ_0]=pℏ_φ H_φmathcal(N)_φ</w:t>
+        <w:t xml:space="preserve">(1-p)L_φ[̂φ-φ_0]=pℏ_φ H_φN_φ</w:t>
       </w:r>
     </w:p>
     <w:p>
@@ -2293,7 +2293,7 @@
           <w:sz w:val="20"/>
           <w:szCs w:val="20"/>
         </w:rPr>
-        <w:t xml:space="preserve">mathcal(L)_f[f_m-χ_mf_(m-1)]=ℏ_fH_fmathcal(R)^f_m</w:t>
+        <w:t xml:space="preserve">L_f[f_m-χ_mf_(m-1)]=ℏ_fH_fR^f_m</w:t>
       </w:r>
     </w:p>
     <w:p>
@@ -2319,7 +2319,7 @@
           <w:sz w:val="20"/>
           <w:szCs w:val="20"/>
         </w:rPr>
-        <w:t xml:space="preserve">mathcal(L)_θ[θ_m-χ_mθ_(m-1)]=ℏ_θ H_θmathcal(R)^θ_m</w:t>
+        <w:t xml:space="preserve">L_θ[θ_m-χ_mθ_(m-1)]=ℏ_θ H_θR^θ_m</w:t>
       </w:r>
     </w:p>
     <w:p>
@@ -2345,7 +2345,7 @@
           <w:sz w:val="20"/>
           <w:szCs w:val="20"/>
         </w:rPr>
-        <w:t xml:space="preserve">mathcal(L)_φ[φ_m-χ_mφ_(m-1)]=ℏ_φ H_φmathcal(R)^φ_m</w:t>
+        <w:t xml:space="preserve">L_φ[φ_m-χ_mφ_(m-1)]=ℏ_φ H_φR^φ_m</w:t>
       </w:r>
     </w:p>
     <w:p>
@@ -2397,7 +2397,7 @@
           <w:sz w:val="20"/>
           <w:szCs w:val="20"/>
         </w:rPr>
-        <w:t xml:space="preserve">mathcal(R)^f_m=(A_1)/(A_2)(1+(1)/(β^∗))f_(m-1)^(iv)+∑_(n=0)^(m-1)f_(m-1-n)f_n'''-∑_(n=0)^(m-1)f_(m-1-n)'f_n''-(Sq)/(2)(3f_(m-1)''+η f_(m-1)''')-(A_3)/(A_2)Mf_(m-1)''-(A_1)/(A_2)(1+(1)/(β^∗))K_Pf_(m-1)''</w:t>
+        <w:t xml:space="preserve">R^f_m=(A_1)/(A_2)(1+(1)/(β^∗))f_(m-1)^(iv)+∑_(n=0)^(m-1)f_(m-1-n)f_n'''-∑_(n=0)^(m-1)f_(m-1-n)'f_n''-(Sq)/(2)(3f_(m-1)''+η f_(m-1)''')-(A_3)/(A_2)Mf_(m-1)''-(A_1)/(A_2)(1+(1)/(β^∗))K_Pf_(m-1)''</w:t>
       </w:r>
     </w:p>
     <w:p>
@@ -2423,7 +2423,7 @@
           <w:sz w:val="20"/>
           <w:szCs w:val="20"/>
         </w:rPr>
-        <w:t xml:space="preserve">mathcal(R)^θ_m=(A_4+(4)/(3)Rd)θ_(m-1)''-Pr Hs θ_(m-1)-A_5Pr[(Sq)/(2)η θ_(m-1)'-∑_(n=0)^(m-1)f_(m-1-n)θ_n']+A_1(1+(1)/(β^∗))Ec Pr∑_(n=0)^(m-1)(f_(m-1-n)''f_n''+4γ f_(m-1-n)'f_n')+A_3Ec Pr M∑_(n=0)^(m-1)f_(m-1-n)'f_n'+Pr Df φ_(m-1)''</w:t>
+        <w:t xml:space="preserve">R^θ_m=(A_4+(4)/(3)Rd)θ_(m-1)''-Pr Hs θ_(m-1)-A_5Pr[(Sq)/(2)η θ_(m-1)'-∑_(n=0)^(m-1)f_(m-1-n)θ_n']+A_1(1+(1)/(β^∗))Ec Pr∑_(n=0)^(m-1)(f_(m-1-n)''f_n''+4γ f_(m-1-n)'f_n')+A_3Ec Pr M∑_(n=0)^(m-1)f_(m-1-n)'f_n'+Pr Df φ_(m-1)''</w:t>
       </w:r>
     </w:p>
     <w:p>
@@ -2449,7 +2449,7 @@
           <w:sz w:val="20"/>
           <w:szCs w:val="20"/>
         </w:rPr>
-        <w:t xml:space="preserve">mathcal(R)^φ_m=φ_(m-1)''+Sc∑_(n=0)^(m-1)(f_(m-1-n)φ_n'-f_(m-1-n)'φ_n)-Sc(Sq)/(2)η φ_(m-1)'-Sc K Ξ_(m-1)+Sc Sr θ_(m-1)''</w:t>
+        <w:t xml:space="preserve">R^φ_m=φ_(m-1)''+Sc∑_(n=0)^(m-1)(f_(m-1-n)φ_n'-f_(m-1-n)'φ_n)-Sc(Sq)/(2)η φ_(m-1)'-Sc K Ξ_(m-1)+Sc Sr θ_(m-1)''</w:t>
       </w:r>
     </w:p>
     <w:p>
@@ -2527,7 +2527,7 @@
           <w:sz w:val="20"/>
           <w:szCs w:val="20"/>
         </w:rPr>
-        <w:t xml:space="preserve">E^f_m=(1)/(N+1)∑_(j=0)^(N)[mathcal(N)_f(∑_(i=0)^(m)f_i(η_j))]^2</w:t>
+        <w:t xml:space="preserve">E^f_m=(1)/(N+1)∑_(j=0)^(N)[N_f(∑_(i=0)^(m)f_i(η_j))]^2</w:t>
       </w:r>
     </w:p>
     <w:p>
@@ -2553,7 +2553,7 @@
           <w:sz w:val="20"/>
           <w:szCs w:val="20"/>
         </w:rPr>
-        <w:t xml:space="preserve">E^θ_m=(1)/(N+1)∑_(j=0)^(N)[mathcal(N)_θ(∑_(i=0)^(m)f_i,θ_i,φ_i)]^2, E^φ_m=(1)/(N+1)∑_(j=0)^(N)[mathcal(N)_φ(∑_(i=0)^(m)f_i,θ_i,φ_i)]^2</w:t>
+        <w:t xml:space="preserve">E^θ_m=(1)/(N+1)∑_(j=0)^(N)[N_θ(∑_(i=0)^(m)f_i,θ_i,φ_i)]^2, E^φ_m=(1)/(N+1)∑_(j=0)^(N)[N_φ(∑_(i=0)^(m)f_i,θ_i,φ_i)]^2</w:t>
       </w:r>
     </w:p>
     <w:p>

</xml_diff>